<commit_message>
changing captcha on my website
</commit_message>
<xml_diff>
--- a/public/John_Adrian_Ticatic_Cover_Letter.docx
+++ b/public/John_Adrian_Ticatic_Cover_Letter.docx
@@ -34,10 +34,10 @@
         <w:pStyle w:val="NormalWeb"/>
       </w:pPr>
       <w:r>
-        <w:t>December 1</w:t>
-      </w:r>
-      <w:r>
-        <w:t>7</w:t>
+        <w:t xml:space="preserve">December </w:t>
+      </w:r>
+      <w:r>
+        <w:t>22</w:t>
       </w:r>
       <w:r>
         <w:t>, 2025</w:t>
@@ -56,9 +56,16 @@
       <w:r>
         <w:br/>
       </w:r>
-      <w:r>
-        <w:t>Metropolitan Bank &amp; Trust Company</w:t>
-      </w:r>
+      <w:proofErr w:type="spellStart"/>
+      <w:r>
+        <w:t>Sourcefit</w:t>
+      </w:r>
+      <w:proofErr w:type="spellEnd"/>
+      <w:r>
+        <w:t xml:space="preserve"> Philippines, Inc.</w:t>
+      </w:r>
+      <w:bookmarkStart w:id="0" w:name="_GoBack"/>
+      <w:bookmarkEnd w:id="0"/>
     </w:p>
     <w:p>
       <w:pPr>
@@ -79,13 +86,7 @@
         <w:rPr>
           <w:rStyle w:val="Strong"/>
         </w:rPr>
-        <w:t>Programmer</w:t>
-      </w:r>
-      <w:r>
-        <w:rPr>
-          <w:rStyle w:val="Strong"/>
-        </w:rPr>
-        <w:t xml:space="preserve"> Analyst</w:t>
+        <w:t>Full-Stack Platform Engineer</w:t>
       </w:r>
       <w:r>
         <w:rPr>
@@ -96,23 +97,29 @@
       <w:r>
         <w:t xml:space="preserve">at </w:t>
       </w:r>
+      <w:proofErr w:type="spellStart"/>
       <w:r>
         <w:rPr>
           <w:rStyle w:val="Strong"/>
         </w:rPr>
-        <w:t>Metropolitan Bank &amp; Trust Company</w:t>
-      </w:r>
+        <w:t>Sourcefit</w:t>
+      </w:r>
+      <w:proofErr w:type="spellEnd"/>
       <w:r>
         <w:rPr>
           <w:rStyle w:val="Strong"/>
         </w:rPr>
-        <w:t xml:space="preserve">. </w:t>
+        <w:t xml:space="preserve"> Philippines, Inc.</w:t>
+      </w:r>
+      <w:r>
+        <w:rPr>
+          <w:rStyle w:val="Strong"/>
+        </w:rPr>
+        <w:t xml:space="preserve"> </w:t>
       </w:r>
       <w:r>
         <w:t>I am a Software Developer with 2 years of experience in building web applications, desktop applications, and backend systems, as well as providing technical support in corporate environments. My background has equipped me with strong problem-solving skills, a solid foundation in programming, and the ability to work effectively both independently and within a team.</w:t>
       </w:r>
-      <w:bookmarkStart w:id="0" w:name="_GoBack"/>
-      <w:bookmarkEnd w:id="0"/>
     </w:p>
     <w:p>
       <w:pPr>

</xml_diff>

<commit_message>
remove snowfall on my portfolio
</commit_message>
<xml_diff>
--- a/public/John_Adrian_Ticatic_Cover_Letter.docx
+++ b/public/John_Adrian_Ticatic_Cover_Letter.docx
@@ -37,8 +37,13 @@
         <w:t xml:space="preserve">December </w:t>
       </w:r>
       <w:r>
-        <w:t>22</w:t>
-      </w:r>
+        <w:t>2</w:t>
+      </w:r>
+      <w:r>
+        <w:t>9</w:t>
+      </w:r>
+      <w:bookmarkStart w:id="0" w:name="_GoBack"/>
+      <w:bookmarkEnd w:id="0"/>
       <w:r>
         <w:t>, 2025</w:t>
       </w:r>
@@ -58,14 +63,12 @@
       </w:r>
       <w:proofErr w:type="spellStart"/>
       <w:r>
-        <w:t>Sourcefit</w:t>
+        <w:t>iCXeed</w:t>
       </w:r>
       <w:proofErr w:type="spellEnd"/>
       <w:r>
-        <w:t xml:space="preserve"> Philippines, Inc.</w:t>
-      </w:r>
-      <w:bookmarkStart w:id="0" w:name="_GoBack"/>
-      <w:bookmarkEnd w:id="0"/>
+        <w:t xml:space="preserve"> Philippines Inc.</w:t>
+      </w:r>
     </w:p>
     <w:p>
       <w:pPr>
@@ -86,7 +89,7 @@
         <w:rPr>
           <w:rStyle w:val="Strong"/>
         </w:rPr>
-        <w:t>Full-Stack Platform Engineer</w:t>
+        <w:t>Junior Cloud Developer</w:t>
       </w:r>
       <w:r>
         <w:rPr>
@@ -102,20 +105,20 @@
         <w:rPr>
           <w:rStyle w:val="Strong"/>
         </w:rPr>
-        <w:t>Sourcefit</w:t>
+        <w:t>iCXeed</w:t>
       </w:r>
       <w:proofErr w:type="spellEnd"/>
       <w:r>
         <w:rPr>
           <w:rStyle w:val="Strong"/>
         </w:rPr>
-        <w:t xml:space="preserve"> Philippines, Inc.</w:t>
+        <w:t xml:space="preserve"> Philippines Inc</w:t>
       </w:r>
       <w:r>
         <w:rPr>
           <w:rStyle w:val="Strong"/>
         </w:rPr>
-        <w:t xml:space="preserve"> </w:t>
+        <w:t xml:space="preserve">. </w:t>
       </w:r>
       <w:r>
         <w:t>I am a Software Developer with 2 years of experience in building web applications, desktop applications, and backend systems, as well as providing technical support in corporate environments. My background has equipped me with strong problem-solving skills, a solid foundation in programming, and the ability to work effectively both independently and within a team.</w:t>

</xml_diff>

<commit_message>
changing the github link for dashboard
</commit_message>
<xml_diff>
--- a/public/John_Adrian_Ticatic_Cover_Letter.docx
+++ b/public/John_Adrian_Ticatic_Cover_Letter.docx
@@ -34,18 +34,16 @@
         <w:pStyle w:val="NormalWeb"/>
       </w:pPr>
       <w:r>
-        <w:t xml:space="preserve">December </w:t>
-      </w:r>
-      <w:r>
-        <w:t>2</w:t>
-      </w:r>
-      <w:r>
-        <w:t>9</w:t>
-      </w:r>
-      <w:bookmarkStart w:id="0" w:name="_GoBack"/>
-      <w:bookmarkEnd w:id="0"/>
-      <w:r>
-        <w:t>, 2025</w:t>
+        <w:t>February</w:t>
+      </w:r>
+      <w:r>
+        <w:t xml:space="preserve"> </w:t>
+      </w:r>
+      <w:r>
+        <w:t>11</w:t>
+      </w:r>
+      <w:r>
+        <w:t>, 2026</w:t>
       </w:r>
     </w:p>
     <w:p>
@@ -61,13 +59,8 @@
       <w:r>
         <w:br/>
       </w:r>
-      <w:proofErr w:type="spellStart"/>
-      <w:r>
-        <w:t>iCXeed</w:t>
-      </w:r>
-      <w:proofErr w:type="spellEnd"/>
-      <w:r>
-        <w:t xml:space="preserve"> Philippines Inc.</w:t>
+      <w:r>
+        <w:t>Accenture Philippines</w:t>
       </w:r>
     </w:p>
     <w:p>
@@ -89,7 +82,7 @@
         <w:rPr>
           <w:rStyle w:val="Strong"/>
         </w:rPr>
-        <w:t>Junior Cloud Developer</w:t>
+        <w:t>Generative AI Application Developer</w:t>
       </w:r>
       <w:r>
         <w:rPr>
@@ -97,28 +90,28 @@
         </w:rPr>
         <w:t xml:space="preserve"> </w:t>
       </w:r>
+      <w:bookmarkStart w:id="0" w:name="_GoBack"/>
+      <w:bookmarkEnd w:id="0"/>
       <w:r>
         <w:t xml:space="preserve">at </w:t>
       </w:r>
-      <w:proofErr w:type="spellStart"/>
+      <w:r>
+        <w:rPr>
+          <w:b/>
+        </w:rPr>
+        <w:t>Accenture Philippines</w:t>
+      </w:r>
       <w:r>
         <w:rPr>
           <w:rStyle w:val="Strong"/>
         </w:rPr>
-        <w:t>iCXeed</w:t>
-      </w:r>
-      <w:proofErr w:type="spellEnd"/>
+        <w:t>.</w:t>
+      </w:r>
       <w:r>
         <w:rPr>
           <w:rStyle w:val="Strong"/>
         </w:rPr>
-        <w:t xml:space="preserve"> Philippines Inc</w:t>
-      </w:r>
-      <w:r>
-        <w:rPr>
-          <w:rStyle w:val="Strong"/>
-        </w:rPr>
-        <w:t xml:space="preserve">. </w:t>
+        <w:t xml:space="preserve"> </w:t>
       </w:r>
       <w:r>
         <w:t>I am a Software Developer with 2 years of experience in building web applications, desktop applications, and backend systems, as well as providing technical support in corporate environments. My background has equipped me with strong problem-solving skills, a solid foundation in programming, and the ability to work effectively both independently and within a team.</w:t>

</xml_diff>